<commit_message>
CR #47155 FRD: Finalize screenshots, technology upgrade and 2022 comparison
Co-Authored-By: Claude Opus 5.5 <noreply@anthropic.com>
Claude-Session: https://claude.ai/code/session_01Jo5QJUTgChnSczX21BSHr9
</commit_message>
<xml_diff>
--- a/docs/cr-47155/CR47155_02_FRD.docx
+++ b/docs/cr-47155/CR47155_02_FRD.docx
@@ -345,6 +345,223 @@
         </w:tc>
       </w:tr>
     </w:tbl>
+    <w:p/>
+    <w:p>
+      <w:r>
+        <w:rPr>
+          <w:b/>
+        </w:rPr>
+        <w:t>What the reader sees</w:t>
+      </w:r>
+    </w:p>
+    <w:tbl>
+      <w:tblPr>
+        <w:tblW w:type="auto" w:w="0"/>
+        <w:jc w:val="center"/>
+        <w:tblLook w:firstColumn="1" w:firstRow="1" w:lastColumn="0" w:lastRow="0" w:noHBand="0" w:noVBand="1" w:val="04A0"/>
+      </w:tblPr>
+      <w:tblGrid>
+        <w:gridCol w:w="3324"/>
+        <w:gridCol w:w="3324"/>
+        <w:gridCol w:w="3324"/>
+      </w:tblGrid>
+      <w:tr>
+        <w:tc>
+          <w:tcPr>
+            <w:tcW w:type="dxa" w:w="3324"/>
+          </w:tcPr>
+          <w:p>
+            <w:pPr>
+              <w:jc w:val="center"/>
+            </w:pPr>
+            <w:r>
+              <w:drawing>
+                <wp:inline xmlns:a="http://schemas.openxmlformats.org/drawingml/2006/main" xmlns:pic="http://schemas.openxmlformats.org/drawingml/2006/picture">
+                  <wp:extent cx="1872000" cy="4058277"/>
+                  <wp:docPr id="1" name="Picture 1"/>
+                  <wp:cNvGraphicFramePr>
+                    <a:graphicFrameLocks noChangeAspect="1"/>
+                  </wp:cNvGraphicFramePr>
+                  <a:graphic>
+                    <a:graphicData uri="http://schemas.openxmlformats.org/drawingml/2006/picture">
+                      <pic:pic>
+                        <pic:nvPicPr>
+                          <pic:cNvPr id="0" name="15_finalize_meters_left.png"/>
+                          <pic:cNvPicPr/>
+                        </pic:nvPicPr>
+                        <pic:blipFill>
+                          <a:blip r:embed="rId12"/>
+                          <a:stretch>
+                            <a:fillRect/>
+                          </a:stretch>
+                        </pic:blipFill>
+                        <pic:spPr>
+                          <a:xfrm>
+                            <a:off x="0" y="0"/>
+                            <a:ext cx="1872000" cy="4058277"/>
+                          </a:xfrm>
+                          <a:prstGeom prst="rect"/>
+                        </pic:spPr>
+                      </pic:pic>
+                    </a:graphicData>
+                  </a:graphic>
+                </wp:inline>
+              </w:drawing>
+            </w:r>
+          </w:p>
+        </w:tc>
+        <w:tc>
+          <w:tcPr>
+            <w:tcW w:type="dxa" w:w="3324"/>
+          </w:tcPr>
+          <w:p>
+            <w:pPr>
+              <w:jc w:val="center"/>
+            </w:pPr>
+            <w:r>
+              <w:drawing>
+                <wp:inline xmlns:a="http://schemas.openxmlformats.org/drawingml/2006/main" xmlns:pic="http://schemas.openxmlformats.org/drawingml/2006/picture">
+                  <wp:extent cx="1872000" cy="4058277"/>
+                  <wp:docPr id="2" name="Picture 2"/>
+                  <wp:cNvGraphicFramePr>
+                    <a:graphicFrameLocks noChangeAspect="1"/>
+                  </wp:cNvGraphicFramePr>
+                  <a:graphic>
+                    <a:graphicData uri="http://schemas.openxmlformats.org/drawingml/2006/picture">
+                      <pic:pic>
+                        <pic:nvPicPr>
+                          <pic:cNvPr id="0" name="16_finalize_ready.png"/>
+                          <pic:cNvPicPr/>
+                        </pic:nvPicPr>
+                        <pic:blipFill>
+                          <a:blip r:embed="rId13"/>
+                          <a:stretch>
+                            <a:fillRect/>
+                          </a:stretch>
+                        </pic:blipFill>
+                        <pic:spPr>
+                          <a:xfrm>
+                            <a:off x="0" y="0"/>
+                            <a:ext cx="1872000" cy="4058277"/>
+                          </a:xfrm>
+                          <a:prstGeom prst="rect"/>
+                        </pic:spPr>
+                      </pic:pic>
+                    </a:graphicData>
+                  </a:graphic>
+                </wp:inline>
+              </w:drawing>
+            </w:r>
+          </w:p>
+        </w:tc>
+        <w:tc>
+          <w:tcPr>
+            <w:tcW w:type="dxa" w:w="3324"/>
+          </w:tcPr>
+          <w:p>
+            <w:pPr>
+              <w:jc w:val="center"/>
+            </w:pPr>
+            <w:r>
+              <w:drawing>
+                <wp:inline xmlns:a="http://schemas.openxmlformats.org/drawingml/2006/main" xmlns:pic="http://schemas.openxmlformats.org/drawingml/2006/picture">
+                  <wp:extent cx="1872000" cy="4058277"/>
+                  <wp:docPr id="3" name="Picture 3"/>
+                  <wp:cNvGraphicFramePr>
+                    <a:graphicFrameLocks noChangeAspect="1"/>
+                  </wp:cNvGraphicFramePr>
+                  <a:graphic>
+                    <a:graphicData uri="http://schemas.openxmlformats.org/drawingml/2006/picture">
+                      <pic:pic>
+                        <pic:nvPicPr>
+                          <pic:cNvPr id="0" name="17_finalize_confirm.png"/>
+                          <pic:cNvPicPr/>
+                        </pic:nvPicPr>
+                        <pic:blipFill>
+                          <a:blip r:embed="rId14"/>
+                          <a:stretch>
+                            <a:fillRect/>
+                          </a:stretch>
+                        </pic:blipFill>
+                        <pic:spPr>
+                          <a:xfrm>
+                            <a:off x="0" y="0"/>
+                            <a:ext cx="1872000" cy="4058277"/>
+                          </a:xfrm>
+                          <a:prstGeom prst="rect"/>
+                        </pic:spPr>
+                      </pic:pic>
+                    </a:graphicData>
+                  </a:graphic>
+                </wp:inline>
+              </w:drawing>
+            </w:r>
+          </w:p>
+        </w:tc>
+      </w:tr>
+      <w:tr>
+        <w:tc>
+          <w:tcPr>
+            <w:tcW w:type="dxa" w:w="3324"/>
+          </w:tcPr>
+          <w:p>
+            <w:pPr>
+              <w:jc w:val="center"/>
+            </w:pPr>
+            <w:r>
+              <w:rPr>
+                <w:i/>
+                <w:sz w:val="18"/>
+              </w:rPr>
+              <w:t>1. Meters still to read: the button is grey and shows how many are left.</w:t>
+            </w:r>
+          </w:p>
+        </w:tc>
+        <w:tc>
+          <w:tcPr>
+            <w:tcW w:type="dxa" w:w="3324"/>
+          </w:tcPr>
+          <w:p>
+            <w:pPr>
+              <w:jc w:val="center"/>
+            </w:pPr>
+            <w:r>
+              <w:rPr>
+                <w:i/>
+                <w:sz w:val="18"/>
+              </w:rPr>
+              <w:t>2. Every meter is read: the button can be pressed.</w:t>
+            </w:r>
+          </w:p>
+        </w:tc>
+        <w:tc>
+          <w:tcPr>
+            <w:tcW w:type="dxa" w:w="3324"/>
+          </w:tcPr>
+          <w:p>
+            <w:pPr>
+              <w:jc w:val="center"/>
+            </w:pPr>
+            <w:r>
+              <w:rPr>
+                <w:i/>
+                <w:sz w:val="18"/>
+              </w:rPr>
+              <w:t>3. The phone asks once more before sending the property to the office.</w:t>
+            </w:r>
+          </w:p>
+        </w:tc>
+      </w:tr>
+    </w:tbl>
+    <w:p>
+      <w:r>
+        <w:rPr>
+          <w:i/>
+          <w:sz w:val="16"/>
+        </w:rPr>
+        <w:t>Screens from the app with sample data.</w:t>
+      </w:r>
+    </w:p>
     <w:p/>
     <w:p>
       <w:pPr>

</xml_diff>

<commit_message>
CR #47155 documents: upgrade versions as shipped (Compose Multiplatform 1.11.1, Ktor 3.5.2, datetime 0.7.1, Xcode 26)
Co-Authored-By: Claude Opus 5.5 <noreply@anthropic.com>
Claude-Session: https://claude.ai/code/session_01Jo5QJUTgChnSczX21BSHr9
</commit_message>
<xml_diff>
--- a/docs/cr-47155/CR47155_02_FRD.docx
+++ b/docs/cr-47155/CR47155_02_FRD.docx
@@ -1207,7 +1207,7 @@
               <w:rPr>
                 <w:sz w:val="19"/>
               </w:rPr>
-              <w:t>1.12.2</w:t>
+              <w:t>1.11.1</w:t>
             </w:r>
           </w:p>
         </w:tc>
@@ -1252,7 +1252,7 @@
               <w:rPr>
                 <w:sz w:val="19"/>
               </w:rPr>
-              <w:t>3.6.0</w:t>
+              <w:t>3.5.2</w:t>
             </w:r>
           </w:p>
         </w:tc>
@@ -1432,7 +1432,7 @@
               <w:rPr>
                 <w:sz w:val="19"/>
               </w:rPr>
-              <w:t>0.6.2</w:t>
+              <w:t>0.7.1 (with the 0.6 API)</w:t>
             </w:r>
           </w:p>
         </w:tc>
@@ -1441,7 +1441,7 @@
     <w:p/>
     <w:p>
       <w:r>
-        <w:t>Not in this change: kotlinx-datetime 0.7+ (moves date types into Kotlin itself; a separate code change) and Android Gradle Plugin 9 (needs the app split into separate modules). Both are proposed as a later CR.</w:t>
+        <w:t>Not in this change: Android Gradle Plugin 9 (needs the app split into separate modules), and with it Compose Multiplatform 1.12 and Ktor 3.6, which need Android Gradle Plugin 9 and Android 17 (compile SDK 37). This is proposed as a later CR. The iOS app is now built with Xcode 26.</w:t>
       </w:r>
     </w:p>
     <w:p>
@@ -1653,7 +1653,7 @@
               <w:rPr>
                 <w:sz w:val="19"/>
               </w:rPr>
-              <w:t>Compose Multiplatform 1.12.2</w:t>
+              <w:t>Compose Multiplatform 1.11.1</w:t>
             </w:r>
           </w:p>
         </w:tc>
@@ -1712,7 +1712,7 @@
               <w:rPr>
                 <w:sz w:val="19"/>
               </w:rPr>
-              <w:t>3.6.0</w:t>
+              <w:t>3.5.2</w:t>
             </w:r>
           </w:p>
         </w:tc>
@@ -1948,7 +1948,7 @@
               <w:rPr>
                 <w:sz w:val="19"/>
               </w:rPr>
-              <w:t>0.6.2</w:t>
+              <w:t>0.7.1</w:t>
             </w:r>
           </w:p>
         </w:tc>

</xml_diff>

<commit_message>
CR #47155 FRD 1.1 for business sign-off: field changes from UAT (1-second move-on, no commas, several meters, read again) and a sign-off table
Co-Authored-By: Claude Opus 5.5 <noreply@anthropic.com>
Claude-Session: https://claude.ai/code/session_01Jo5QJUTgChnSczX21BSHr9
</commit_message>
<xml_diff>
--- a/docs/cr-47155/CR47155_02_FRD.docx
+++ b/docs/cr-47155/CR47155_02_FRD.docx
@@ -113,7 +113,7 @@
           </w:tcPr>
           <w:p>
             <w:r>
-              <w:t>1.0</w:t>
+              <w:t>1.1 – for business sign-off</w:t>
             </w:r>
           </w:p>
         </w:tc>
@@ -142,7 +142,7 @@
           </w:tcPr>
           <w:p>
             <w:r>
-              <w:t>18 October 2026</w:t>
+              <w:t>26 October 2026</w:t>
             </w:r>
           </w:p>
         </w:tc>
@@ -937,7 +937,399 @@
         <w:pStyle w:val="Heading2"/>
       </w:pPr>
       <w:r>
-        <w:t>E. Technology upgrade</w:t>
+        <w:t>E. Reading meters in the field (UAT feedback)</w:t>
+      </w:r>
+    </w:p>
+    <w:p>
+      <w:r>
+        <w:rPr>
+          <w:i w:val="0"/>
+        </w:rPr>
+        <w:t>These changes come from the first weeks of UAT. They make the phone faster and harder to get wrong.</w:t>
+      </w:r>
+    </w:p>
+    <w:tbl>
+      <w:tblPr>
+        <w:tblStyle w:val="TableGrid"/>
+        <w:tblW w:type="auto" w:w="0"/>
+        <w:jc w:val="center"/>
+        <w:tblLook w:firstColumn="1" w:firstRow="1" w:lastColumn="0" w:lastRow="0" w:noHBand="0" w:noVBand="1" w:val="04A0"/>
+      </w:tblPr>
+      <w:tblGrid>
+        <w:gridCol w:w="9972"/>
+      </w:tblGrid>
+      <w:tr>
+        <w:tc>
+          <w:tcPr>
+            <w:tcW w:type="dxa" w:w="9972"/>
+            <w:shd w:val="clear" w:color="auto" w:fill="1F3A5F"/>
+          </w:tcPr>
+          <w:p>
+            <w:r/>
+            <w:r>
+              <w:rPr>
+                <w:b/>
+                <w:color w:val="FFFFFF"/>
+                <w:sz w:val="19"/>
+              </w:rPr>
+              <w:t>Requirement</w:t>
+            </w:r>
+          </w:p>
+        </w:tc>
+      </w:tr>
+      <w:tr>
+        <w:tc>
+          <w:tcPr>
+            <w:tcW w:type="dxa" w:w="9972"/>
+          </w:tcPr>
+          <w:p>
+            <w:r/>
+            <w:r>
+              <w:rPr>
+                <w:sz w:val="19"/>
+              </w:rPr>
+              <w:t>After a reading is done, the next meter opens within 1 second. The reading is kept on the phone first, so nothing is lost if the signal is slow; it is sent in the background. If the office refuses it, the meter comes back as "Read again" with the reason.</w:t>
+            </w:r>
+          </w:p>
+        </w:tc>
+      </w:tr>
+      <w:tr>
+        <w:tc>
+          <w:tcPr>
+            <w:tcW w:type="dxa" w:w="9972"/>
+          </w:tcPr>
+          <w:p>
+            <w:r/>
+            <w:r>
+              <w:rPr>
+                <w:sz w:val="19"/>
+              </w:rPr>
+              <w:t>Readings are shown as plain numbers, exactly as on the meter, with no commas: 52500, not 52,500.</w:t>
+            </w:r>
+          </w:p>
+        </w:tc>
+      </w:tr>
+      <w:tr>
+        <w:tc>
+          <w:tcPr>
+            <w:tcW w:type="dxa" w:w="9972"/>
+          </w:tcPr>
+          <w:p>
+            <w:r/>
+            <w:r>
+              <w:rPr>
+                <w:sz w:val="19"/>
+              </w:rPr>
+              <w:t>A property with one Sewerage and one Irrigation meter shows two large tabs with the full meter numbers.</w:t>
+            </w:r>
+          </w:p>
+        </w:tc>
+      </w:tr>
+      <w:tr>
+        <w:tc>
+          <w:tcPr>
+            <w:tcW w:type="dxa" w:w="9972"/>
+          </w:tcPr>
+          <w:p>
+            <w:r/>
+            <w:r>
+              <w:rPr>
+                <w:sz w:val="19"/>
+              </w:rPr>
+              <w:t>A property with more than two meters shows which meter is being read (for example "Meter 2 of 6 · Sewerage 2002-3") and a Change meter button that lists every meter on its own line with what has been typed so far. A number cannot be typed into the wrong meter by mistake.</w:t>
+            </w:r>
+          </w:p>
+        </w:tc>
+      </w:tr>
+      <w:tr>
+        <w:tc>
+          <w:tcPr>
+            <w:tcW w:type="dxa" w:w="9972"/>
+          </w:tcPr>
+          <w:p>
+            <w:r/>
+            <w:r>
+              <w:rPr>
+                <w:sz w:val="19"/>
+              </w:rPr>
+              <w:t>A meter can be read more than once in a month. The phone asks "Read again?" first. The new reading replaces the earlier one; the earlier one is kept for the record, not deleted.</w:t>
+            </w:r>
+          </w:p>
+        </w:tc>
+      </w:tr>
+      <w:tr>
+        <w:tc>
+          <w:tcPr>
+            <w:tcW w:type="dxa" w:w="9972"/>
+          </w:tcPr>
+          <w:p>
+            <w:r/>
+            <w:r>
+              <w:rPr>
+                <w:sz w:val="19"/>
+              </w:rPr>
+              <w:t>A new reading cannot replace one that has already been sent to PMS for billing; the phone says to ask the office to change it.</w:t>
+            </w:r>
+          </w:p>
+        </w:tc>
+      </w:tr>
+      <w:tr>
+        <w:tc>
+          <w:tcPr>
+            <w:tcW w:type="dxa" w:w="9972"/>
+          </w:tcPr>
+          <w:p>
+            <w:r/>
+            <w:r>
+              <w:rPr>
+                <w:sz w:val="19"/>
+              </w:rPr>
+              <w:t>If a property was already finalized and one of its meters is read again, the reader finalizes the property again so the bill figures use the new reading.</w:t>
+            </w:r>
+          </w:p>
+        </w:tc>
+      </w:tr>
+      <w:tr>
+        <w:tc>
+          <w:tcPr>
+            <w:tcW w:type="dxa" w:w="9972"/>
+          </w:tcPr>
+          <w:p>
+            <w:r/>
+            <w:r>
+              <w:rPr>
+                <w:sz w:val="19"/>
+              </w:rPr>
+              <w:t>The list of properties loads in seconds; readers no longer see "0 properties". The home screen has a download button that keeps trying until the list arrives.</w:t>
+            </w:r>
+          </w:p>
+        </w:tc>
+      </w:tr>
+    </w:tbl>
+    <w:p/>
+    <w:p>
+      <w:r>
+        <w:rPr>
+          <w:b/>
+        </w:rPr>
+        <w:t>What the reader sees</w:t>
+      </w:r>
+    </w:p>
+    <w:tbl>
+      <w:tblPr>
+        <w:tblW w:type="auto" w:w="0"/>
+        <w:jc w:val="center"/>
+        <w:tblLook w:firstColumn="1" w:firstRow="1" w:lastColumn="0" w:lastRow="0" w:noHBand="0" w:noVBand="1" w:val="04A0"/>
+      </w:tblPr>
+      <w:tblGrid>
+        <w:gridCol w:w="3324"/>
+        <w:gridCol w:w="3324"/>
+        <w:gridCol w:w="3324"/>
+      </w:tblGrid>
+      <w:tr>
+        <w:tc>
+          <w:tcPr>
+            <w:tcW w:type="dxa" w:w="3324"/>
+          </w:tcPr>
+          <w:p>
+            <w:pPr>
+              <w:jc w:val="center"/>
+            </w:pPr>
+            <w:r>
+              <w:drawing>
+                <wp:inline xmlns:a="http://schemas.openxmlformats.org/drawingml/2006/main" xmlns:pic="http://schemas.openxmlformats.org/drawingml/2006/picture">
+                  <wp:extent cx="1872000" cy="4058277"/>
+                  <wp:docPr id="4" name="Picture 4"/>
+                  <wp:cNvGraphicFramePr>
+                    <a:graphicFrameLocks noChangeAspect="1"/>
+                  </wp:cNvGraphicFramePr>
+                  <a:graphic>
+                    <a:graphicData uri="http://schemas.openxmlformats.org/drawingml/2006/picture">
+                      <pic:pic>
+                        <pic:nvPicPr>
+                          <pic:cNvPr id="0" name="18_several_meters.png"/>
+                          <pic:cNvPicPr/>
+                        </pic:nvPicPr>
+                        <pic:blipFill>
+                          <a:blip r:embed="rId15"/>
+                          <a:stretch>
+                            <a:fillRect/>
+                          </a:stretch>
+                        </pic:blipFill>
+                        <pic:spPr>
+                          <a:xfrm>
+                            <a:off x="0" y="0"/>
+                            <a:ext cx="1872000" cy="4058277"/>
+                          </a:xfrm>
+                          <a:prstGeom prst="rect"/>
+                        </pic:spPr>
+                      </pic:pic>
+                    </a:graphicData>
+                  </a:graphic>
+                </wp:inline>
+              </w:drawing>
+            </w:r>
+          </w:p>
+        </w:tc>
+        <w:tc>
+          <w:tcPr>
+            <w:tcW w:type="dxa" w:w="3324"/>
+          </w:tcPr>
+          <w:p>
+            <w:pPr>
+              <w:jc w:val="center"/>
+            </w:pPr>
+            <w:r>
+              <w:drawing>
+                <wp:inline xmlns:a="http://schemas.openxmlformats.org/drawingml/2006/main" xmlns:pic="http://schemas.openxmlformats.org/drawingml/2006/picture">
+                  <wp:extent cx="1872000" cy="4058277"/>
+                  <wp:docPr id="5" name="Picture 5"/>
+                  <wp:cNvGraphicFramePr>
+                    <a:graphicFrameLocks noChangeAspect="1"/>
+                  </wp:cNvGraphicFramePr>
+                  <a:graphic>
+                    <a:graphicData uri="http://schemas.openxmlformats.org/drawingml/2006/picture">
+                      <pic:pic>
+                        <pic:nvPicPr>
+                          <pic:cNvPr id="0" name="19_several_meters_choose.png"/>
+                          <pic:cNvPicPr/>
+                        </pic:nvPicPr>
+                        <pic:blipFill>
+                          <a:blip r:embed="rId16"/>
+                          <a:stretch>
+                            <a:fillRect/>
+                          </a:stretch>
+                        </pic:blipFill>
+                        <pic:spPr>
+                          <a:xfrm>
+                            <a:off x="0" y="0"/>
+                            <a:ext cx="1872000" cy="4058277"/>
+                          </a:xfrm>
+                          <a:prstGeom prst="rect"/>
+                        </pic:spPr>
+                      </pic:pic>
+                    </a:graphicData>
+                  </a:graphic>
+                </wp:inline>
+              </w:drawing>
+            </w:r>
+          </w:p>
+        </w:tc>
+        <w:tc>
+          <w:tcPr>
+            <w:tcW w:type="dxa" w:w="3324"/>
+          </w:tcPr>
+          <w:p>
+            <w:pPr>
+              <w:jc w:val="center"/>
+            </w:pPr>
+            <w:r>
+              <w:drawing>
+                <wp:inline xmlns:a="http://schemas.openxmlformats.org/drawingml/2006/main" xmlns:pic="http://schemas.openxmlformats.org/drawingml/2006/picture">
+                  <wp:extent cx="1872000" cy="4058277"/>
+                  <wp:docPr id="6" name="Picture 6"/>
+                  <wp:cNvGraphicFramePr>
+                    <a:graphicFrameLocks noChangeAspect="1"/>
+                  </wp:cNvGraphicFramePr>
+                  <a:graphic>
+                    <a:graphicData uri="http://schemas.openxmlformats.org/drawingml/2006/picture">
+                      <pic:pic>
+                        <pic:nvPicPr>
+                          <pic:cNvPr id="0" name="07_capture_number.png"/>
+                          <pic:cNvPicPr/>
+                        </pic:nvPicPr>
+                        <pic:blipFill>
+                          <a:blip r:embed="rId17"/>
+                          <a:stretch>
+                            <a:fillRect/>
+                          </a:stretch>
+                        </pic:blipFill>
+                        <pic:spPr>
+                          <a:xfrm>
+                            <a:off x="0" y="0"/>
+                            <a:ext cx="1872000" cy="4058277"/>
+                          </a:xfrm>
+                          <a:prstGeom prst="rect"/>
+                        </pic:spPr>
+                      </pic:pic>
+                    </a:graphicData>
+                  </a:graphic>
+                </wp:inline>
+              </w:drawing>
+            </w:r>
+          </w:p>
+        </w:tc>
+      </w:tr>
+      <w:tr>
+        <w:tc>
+          <w:tcPr>
+            <w:tcW w:type="dxa" w:w="3324"/>
+          </w:tcPr>
+          <w:p>
+            <w:pPr>
+              <w:jc w:val="center"/>
+            </w:pPr>
+            <w:r>
+              <w:rPr>
+                <w:i/>
+                <w:sz w:val="18"/>
+              </w:rPr>
+              <w:t>Several meters: the meter being read and Change meter.</w:t>
+            </w:r>
+          </w:p>
+        </w:tc>
+        <w:tc>
+          <w:tcPr>
+            <w:tcW w:type="dxa" w:w="3324"/>
+          </w:tcPr>
+          <w:p>
+            <w:pPr>
+              <w:jc w:val="center"/>
+            </w:pPr>
+            <w:r>
+              <w:rPr>
+                <w:i/>
+                <w:sz w:val="18"/>
+              </w:rPr>
+              <w:t>Change meter: every meter on its own line.</w:t>
+            </w:r>
+          </w:p>
+        </w:tc>
+        <w:tc>
+          <w:tcPr>
+            <w:tcW w:type="dxa" w:w="3324"/>
+          </w:tcPr>
+          <w:p>
+            <w:pPr>
+              <w:jc w:val="center"/>
+            </w:pPr>
+            <w:r>
+              <w:rPr>
+                <w:i/>
+                <w:sz w:val="18"/>
+              </w:rPr>
+              <w:t>Typing the reading: a plain number, no commas.</w:t>
+            </w:r>
+          </w:p>
+        </w:tc>
+      </w:tr>
+    </w:tbl>
+    <w:p>
+      <w:r>
+        <w:rPr>
+          <w:i/>
+          <w:sz w:val="16"/>
+        </w:rPr>
+        <w:t>Screens from the app with sample data.</w:t>
+      </w:r>
+    </w:p>
+    <w:p/>
+    <w:p>
+      <w:pPr>
+        <w:pStyle w:val="Heading2"/>
+      </w:pPr>
+      <w:r>
+        <w:t>F. Technology upgrade</w:t>
       </w:r>
     </w:p>
     <w:p>
@@ -1449,7 +1841,7 @@
         <w:pStyle w:val="Heading2"/>
       </w:pPr>
       <w:r>
-        <w:t>F. Comparison: 2022 version and now</w:t>
+        <w:t>G. Comparison: 2022 version and now</w:t>
       </w:r>
     </w:p>
     <w:p>
@@ -2210,107 +2602,282 @@
     <w:p/>
     <w:p/>
     <w:p>
+      <w:pPr>
+        <w:pStyle w:val="Heading1"/>
+      </w:pPr>
       <w:r>
-        <w:t>Reviewed by :</w:t>
-      </w:r>
-      <w:r>
-        <w:tab/>
-      </w:r>
-      <w:r>
-        <w:tab/>
-      </w:r>
-      <w:r>
-        <w:tab/>
-      </w:r>
-      <w:r>
-        <w:tab/>
-      </w:r>
-      <w:r>
-        <w:tab/>
-      </w:r>
-      <w:r>
-        <w:tab/>
-      </w:r>
-      <w:r>
-        <w:tab/>
-      </w:r>
-      <w:r>
-        <w:tab/>
-        <w:t>Approved by :</w:t>
+        <w:t>Business sign-off</w:t>
       </w:r>
     </w:p>
-    <w:p/>
     <w:p>
       <w:r>
-        <w:t xml:space="preserve">Imtiyaz Hussain </w:t>
+        <w:t>By signing, the business confirms that the requirements in this document are complete and correct, and that the system may go to production once UAT has passed.</w:t>
       </w:r>
-      <w:r>
-        <w:tab/>
-      </w:r>
-      <w:r>
-        <w:tab/>
-      </w:r>
-      <w:r>
-        <w:tab/>
-      </w:r>
-      <w:r>
-        <w:tab/>
-      </w:r>
-      <w:r>
-        <w:tab/>
-      </w:r>
-      <w:r>
-        <w:tab/>
-      </w:r>
-      <w:r>
-        <w:tab/>
-      </w:r>
-      <w:r>
-        <w:tab/>
-        <w:t xml:space="preserve">Nidhi </w:t>
-      </w:r>
-      <w:proofErr w:type="spellStart"/>
-      <w:r>
-        <w:t>Singhvi</w:t>
-      </w:r>
-      <w:proofErr w:type="spellEnd"/>
     </w:p>
-    <w:p/>
-    <w:p>
-      <w:r>
-        <w:t>Signature</w:t>
-      </w:r>
-      <w:r>
-        <w:tab/>
-      </w:r>
-      <w:r>
-        <w:tab/>
-      </w:r>
-      <w:r>
-        <w:tab/>
-      </w:r>
-      <w:r>
-        <w:tab/>
-      </w:r>
-      <w:r>
-        <w:tab/>
-      </w:r>
-      <w:r>
-        <w:tab/>
-      </w:r>
-      <w:r>
-        <w:tab/>
-      </w:r>
-      <w:r>
-        <w:tab/>
-      </w:r>
-      <w:proofErr w:type="spellStart"/>
-      <w:r>
-        <w:t>Signature</w:t>
-      </w:r>
-      <w:proofErr w:type="spellEnd"/>
-    </w:p>
-    <w:p/>
+    <w:tbl>
+      <w:tblPr>
+        <w:tblStyle w:val="TableGrid"/>
+        <w:tblW w:type="auto" w:w="0"/>
+        <w:jc w:val="center"/>
+        <w:tblLook w:firstColumn="1" w:firstRow="1" w:lastColumn="0" w:lastRow="0" w:noHBand="0" w:noVBand="1" w:val="04A0"/>
+      </w:tblPr>
+      <w:tblGrid>
+        <w:gridCol w:w="2493"/>
+        <w:gridCol w:w="2493"/>
+        <w:gridCol w:w="2493"/>
+        <w:gridCol w:w="2493"/>
+      </w:tblGrid>
+      <w:tr>
+        <w:trPr>
+          <w:trHeight w:val="397"/>
+        </w:trPr>
+        <w:tc>
+          <w:tcPr>
+            <w:tcW w:type="dxa" w:w="2493"/>
+            <w:shd w:val="clear" w:color="auto" w:fill="1F3A5F"/>
+          </w:tcPr>
+          <w:p>
+            <w:r/>
+            <w:r>
+              <w:rPr>
+                <w:b/>
+                <w:color w:val="FFFFFF"/>
+                <w:sz w:val="20"/>
+              </w:rPr>
+              <w:t>Role</w:t>
+            </w:r>
+          </w:p>
+        </w:tc>
+        <w:tc>
+          <w:tcPr>
+            <w:tcW w:type="dxa" w:w="2493"/>
+            <w:shd w:val="clear" w:color="auto" w:fill="1F3A5F"/>
+          </w:tcPr>
+          <w:p>
+            <w:r/>
+            <w:r>
+              <w:rPr>
+                <w:b/>
+                <w:color w:val="FFFFFF"/>
+                <w:sz w:val="20"/>
+              </w:rPr>
+              <w:t>Name</w:t>
+            </w:r>
+          </w:p>
+        </w:tc>
+        <w:tc>
+          <w:tcPr>
+            <w:tcW w:type="dxa" w:w="2493"/>
+            <w:shd w:val="clear" w:color="auto" w:fill="1F3A5F"/>
+          </w:tcPr>
+          <w:p>
+            <w:r/>
+            <w:r>
+              <w:rPr>
+                <w:b/>
+                <w:color w:val="FFFFFF"/>
+                <w:sz w:val="20"/>
+              </w:rPr>
+              <w:t>Signature</w:t>
+            </w:r>
+          </w:p>
+        </w:tc>
+        <w:tc>
+          <w:tcPr>
+            <w:tcW w:type="dxa" w:w="2493"/>
+            <w:shd w:val="clear" w:color="auto" w:fill="1F3A5F"/>
+          </w:tcPr>
+          <w:p>
+            <w:r/>
+            <w:r>
+              <w:rPr>
+                <w:b/>
+                <w:color w:val="FFFFFF"/>
+                <w:sz w:val="20"/>
+              </w:rPr>
+              <w:t>Date</w:t>
+            </w:r>
+          </w:p>
+        </w:tc>
+      </w:tr>
+      <w:tr>
+        <w:trPr>
+          <w:trHeight w:val="680"/>
+        </w:trPr>
+        <w:tc>
+          <w:tcPr>
+            <w:tcW w:type="dxa" w:w="2493"/>
+          </w:tcPr>
+          <w:p>
+            <w:r/>
+            <w:r>
+              <w:rPr>
+                <w:sz w:val="20"/>
+              </w:rPr>
+              <w:t>Prepared by</w:t>
+            </w:r>
+          </w:p>
+        </w:tc>
+        <w:tc>
+          <w:tcPr>
+            <w:tcW w:type="dxa" w:w="2493"/>
+          </w:tcPr>
+          <w:p>
+            <w:r/>
+            <w:r>
+              <w:rPr>
+                <w:sz w:val="20"/>
+              </w:rPr>
+              <w:t>Nayyar Jawaid</w:t>
+            </w:r>
+          </w:p>
+        </w:tc>
+        <w:tc>
+          <w:tcPr>
+            <w:tcW w:type="dxa" w:w="2493"/>
+          </w:tcPr>
+          <w:p>
+            <w:r/>
+            <w:r>
+              <w:rPr>
+                <w:sz w:val="20"/>
+              </w:rPr>
+            </w:r>
+          </w:p>
+        </w:tc>
+        <w:tc>
+          <w:tcPr>
+            <w:tcW w:type="dxa" w:w="2493"/>
+          </w:tcPr>
+          <w:p>
+            <w:r/>
+            <w:r>
+              <w:rPr>
+                <w:sz w:val="20"/>
+              </w:rPr>
+            </w:r>
+          </w:p>
+        </w:tc>
+      </w:tr>
+      <w:tr>
+        <w:trPr>
+          <w:trHeight w:val="680"/>
+        </w:trPr>
+        <w:tc>
+          <w:tcPr>
+            <w:tcW w:type="dxa" w:w="2493"/>
+          </w:tcPr>
+          <w:p>
+            <w:r/>
+            <w:r>
+              <w:rPr>
+                <w:sz w:val="20"/>
+              </w:rPr>
+              <w:t>Reviewed by</w:t>
+            </w:r>
+          </w:p>
+        </w:tc>
+        <w:tc>
+          <w:tcPr>
+            <w:tcW w:type="dxa" w:w="2493"/>
+          </w:tcPr>
+          <w:p>
+            <w:r/>
+            <w:r>
+              <w:rPr>
+                <w:sz w:val="20"/>
+              </w:rPr>
+              <w:t>Imtiyaz Hussain</w:t>
+            </w:r>
+          </w:p>
+        </w:tc>
+        <w:tc>
+          <w:tcPr>
+            <w:tcW w:type="dxa" w:w="2493"/>
+          </w:tcPr>
+          <w:p>
+            <w:r/>
+            <w:r>
+              <w:rPr>
+                <w:sz w:val="20"/>
+              </w:rPr>
+            </w:r>
+          </w:p>
+        </w:tc>
+        <w:tc>
+          <w:tcPr>
+            <w:tcW w:type="dxa" w:w="2493"/>
+          </w:tcPr>
+          <w:p>
+            <w:r/>
+            <w:r>
+              <w:rPr>
+                <w:sz w:val="20"/>
+              </w:rPr>
+            </w:r>
+          </w:p>
+        </w:tc>
+      </w:tr>
+      <w:tr>
+        <w:trPr>
+          <w:trHeight w:val="680"/>
+        </w:trPr>
+        <w:tc>
+          <w:tcPr>
+            <w:tcW w:type="dxa" w:w="2493"/>
+          </w:tcPr>
+          <w:p>
+            <w:r/>
+            <w:r>
+              <w:rPr>
+                <w:sz w:val="20"/>
+              </w:rPr>
+              <w:t>Approved by</w:t>
+            </w:r>
+          </w:p>
+        </w:tc>
+        <w:tc>
+          <w:tcPr>
+            <w:tcW w:type="dxa" w:w="2493"/>
+          </w:tcPr>
+          <w:p>
+            <w:r/>
+            <w:r>
+              <w:rPr>
+                <w:sz w:val="20"/>
+              </w:rPr>
+              <w:t>Nidhi Singhvi</w:t>
+            </w:r>
+          </w:p>
+        </w:tc>
+        <w:tc>
+          <w:tcPr>
+            <w:tcW w:type="dxa" w:w="2493"/>
+          </w:tcPr>
+          <w:p>
+            <w:r/>
+            <w:r>
+              <w:rPr>
+                <w:sz w:val="20"/>
+              </w:rPr>
+            </w:r>
+          </w:p>
+        </w:tc>
+        <w:tc>
+          <w:tcPr>
+            <w:tcW w:type="dxa" w:w="2493"/>
+          </w:tcPr>
+          <w:p>
+            <w:r/>
+            <w:r>
+              <w:rPr>
+                <w:sz w:val="20"/>
+              </w:rPr>
+            </w:r>
+          </w:p>
+        </w:tc>
+      </w:tr>
+    </w:tbl>
     <w:sectPr>
       <w:headerReference w:type="default" r:id="rId8"/>
       <w:footerReference w:type="default" r:id="rId9"/>

</xml_diff>